<commit_message>
Feat: added github contribuation git push
</commit_message>
<xml_diff>
--- a/public/Resume.docx
+++ b/public/Resume.docx
@@ -10,97 +10,131 @@
           <w:rFonts w:ascii="Arial" w:hAnsi="Arial" w:cs="Arial"/>
           <w:b/>
           <w:bCs/>
+          <w:color w:val="000000" w:themeColor="text1"/>
           <w:sz w:val="36"/>
           <w:szCs w:val="36"/>
         </w:rPr>
       </w:pPr>
-      <w:proofErr w:type="spellStart"/>
       <w:r>
         <w:rPr>
           <w:rFonts w:ascii="Arial" w:hAnsi="Arial" w:cs="Arial"/>
           <w:b/>
           <w:bCs/>
+          <w:color w:val="000000" w:themeColor="text1"/>
           <w:sz w:val="36"/>
           <w:szCs w:val="36"/>
         </w:rPr>
-        <w:t>Ehrvayn</w:t>
-      </w:r>
-      <w:proofErr w:type="spellEnd"/>
+        <w:t>Ehrvayn Rayven P. Olivera</w:t>
+      </w:r>
+    </w:p>
+    <w:p>
+      <w:pPr>
+        <w:spacing w:after="0"/>
+        <w:jc w:val="center"/>
+        <w:rPr>
+          <w:rFonts w:ascii="Arial" w:hAnsi="Arial" w:cs="Arial"/>
+          <w:color w:val="000000" w:themeColor="text1"/>
+          <w:sz w:val="20"/>
+          <w:szCs w:val="20"/>
+        </w:rPr>
+      </w:pPr>
       <w:r>
         <w:rPr>
           <w:rFonts w:ascii="Arial" w:hAnsi="Arial" w:cs="Arial"/>
           <w:b/>
           <w:bCs/>
-          <w:sz w:val="36"/>
-          <w:szCs w:val="36"/>
-        </w:rPr>
-        <w:t xml:space="preserve"> Rayven P. Olivera</w:t>
+          <w:color w:val="000000" w:themeColor="text1"/>
+          <w:sz w:val="20"/>
+          <w:szCs w:val="20"/>
+        </w:rPr>
+        <w:t xml:space="preserve">Full-Stack </w:t>
+      </w:r>
+      <w:r>
+        <w:rPr>
+          <w:rFonts w:ascii="Arial" w:hAnsi="Arial" w:cs="Arial"/>
+          <w:b/>
+          <w:bCs/>
+          <w:color w:val="000000" w:themeColor="text1"/>
+          <w:sz w:val="20"/>
+          <w:szCs w:val="20"/>
+        </w:rPr>
+        <w:t>Developer</w:t>
       </w:r>
     </w:p>
     <w:p>
       <w:pPr>
-        <w:spacing w:after="0"/>
         <w:jc w:val="center"/>
         <w:rPr>
           <w:rFonts w:ascii="Arial" w:hAnsi="Arial" w:cs="Arial"/>
-          <w:sz w:val="20"/>
-          <w:szCs w:val="20"/>
-        </w:rPr>
-      </w:pPr>
-      <w:r>
+          <w:color w:val="000000" w:themeColor="text1"/>
+          <w:sz w:val="20"/>
+          <w:szCs w:val="20"/>
+        </w:rPr>
+      </w:pPr>
+      <w:r>
+        <w:rPr>
+          <w:rFonts w:ascii="Arial" w:hAnsi="Arial" w:cs="Arial"/>
+          <w:color w:val="000000" w:themeColor="text1"/>
+          <w:sz w:val="20"/>
+          <w:szCs w:val="20"/>
+        </w:rPr>
+        <w:t xml:space="preserve">Naga City, Camarines Sur | </w:t>
+      </w:r>
+      <w:r>
+        <w:rPr>
+          <w:rFonts w:ascii="Arial" w:hAnsi="Arial" w:cs="Arial"/>
+          <w:color w:val="000000" w:themeColor="text1"/>
+          <w:sz w:val="20"/>
+          <w:szCs w:val="20"/>
+        </w:rPr>
+        <w:t>ehrvayn</w:t>
+      </w:r>
+      <w:r>
+        <w:rPr>
+          <w:rFonts w:ascii="Arial" w:hAnsi="Arial" w:cs="Arial"/>
+          <w:color w:val="000000" w:themeColor="text1"/>
+          <w:sz w:val="20"/>
+          <w:szCs w:val="20"/>
+        </w:rPr>
+        <w:t>@gmail.com |</w:t>
+      </w:r>
+      <w:r>
+        <w:rPr>
+          <w:rFonts w:ascii="Arial" w:hAnsi="Arial" w:cs="Arial"/>
+          <w:color w:val="000000" w:themeColor="text1"/>
+          <w:sz w:val="20"/>
+          <w:szCs w:val="20"/>
+        </w:rPr>
+        <w:t xml:space="preserve"> 09984518831 |</w:t>
+      </w:r>
+      <w:r>
+        <w:rPr>
+          <w:rFonts w:ascii="Arial" w:hAnsi="Arial" w:cs="Arial"/>
+          <w:color w:val="000000" w:themeColor="text1"/>
+          <w:sz w:val="20"/>
+          <w:szCs w:val="20"/>
+        </w:rPr>
+        <w:t xml:space="preserve"> linkedin.com/in/ehrvayn-rayven-olivera-7228a83b2/</w:t>
+      </w:r>
+    </w:p>
+    <w:p>
+      <w:pPr>
+        <w:jc w:val="center"/>
+        <w:rPr>
+          <w:rFonts w:ascii="Arial" w:hAnsi="Arial" w:cs="Arial"/>
+          <w:color w:val="000000" w:themeColor="text1"/>
+          <w:sz w:val="18"/>
+          <w:szCs w:val="18"/>
+        </w:rPr>
+      </w:pPr>
+    </w:p>
+    <w:p>
+      <w:pPr>
         <w:rPr>
           <w:rFonts w:ascii="Arial" w:hAnsi="Arial" w:cs="Arial"/>
           <w:b/>
           <w:bCs/>
-          <w:sz w:val="20"/>
-          <w:szCs w:val="20"/>
-        </w:rPr>
-        <w:t>Aspiring Full-Stack &amp; Mobile Developer</w:t>
-      </w:r>
-      <w:r>
-        <w:rPr>
-          <w:rFonts w:ascii="Arial" w:hAnsi="Arial" w:cs="Arial"/>
-          <w:sz w:val="20"/>
-          <w:szCs w:val="20"/>
-        </w:rPr>
-        <w:t xml:space="preserve"> </w:t>
-      </w:r>
-    </w:p>
-    <w:p>
-      <w:pPr>
-        <w:jc w:val="center"/>
-        <w:rPr>
-          <w:rFonts w:ascii="Arial" w:hAnsi="Arial" w:cs="Arial"/>
-          <w:sz w:val="18"/>
-          <w:szCs w:val="18"/>
-        </w:rPr>
-      </w:pPr>
-      <w:r>
-        <w:rPr>
-          <w:rFonts w:ascii="Arial" w:hAnsi="Arial" w:cs="Arial"/>
-          <w:sz w:val="18"/>
-          <w:szCs w:val="18"/>
-        </w:rPr>
-        <w:t>Naga City, Camarines Sur | rjmomong@gmail.com | linkedin.com/in/ehrvayn-rayven-olivera-7228a83b2/</w:t>
-      </w:r>
-    </w:p>
-    <w:p>
-      <w:pPr>
-        <w:jc w:val="center"/>
-        <w:rPr>
-          <w:rFonts w:ascii="Arial" w:hAnsi="Arial" w:cs="Arial"/>
-          <w:sz w:val="18"/>
-          <w:szCs w:val="18"/>
-        </w:rPr>
-      </w:pPr>
-    </w:p>
-    <w:p>
-      <w:pPr>
-        <w:rPr>
-          <w:rFonts w:ascii="Arial" w:hAnsi="Arial" w:cs="Arial"/>
-          <w:b/>
-          <w:bCs/>
-          <w:color w:val="0F9ED5" w:themeColor="accent4"/>
+          <w:color w:val="000000" w:themeColor="text1"/>
           <w:sz w:val="20"/>
           <w:szCs w:val="20"/>
         </w:rPr>
@@ -111,34 +145,34 @@
           <w:b/>
           <w:bCs/>
           <w:noProof/>
-          <w:color w:val="0F9ED5" w:themeColor="accent4"/>
+          <w:color w:val="000000" w:themeColor="text1"/>
           <w:sz w:val="20"/>
           <w:szCs w:val="20"/>
         </w:rPr>
         <mc:AlternateContent>
           <mc:Choice Requires="wps">
             <w:drawing>
-              <wp:anchor distT="0" distB="0" distL="114300" distR="114300" simplePos="0" relativeHeight="251661312" behindDoc="0" locked="0" layoutInCell="1" allowOverlap="1" wp14:anchorId="79B9D739" wp14:editId="781375A4">
+              <wp:anchor distT="0" distB="0" distL="114300" distR="114300" simplePos="0" relativeHeight="251671552" behindDoc="0" locked="0" layoutInCell="1" allowOverlap="1" wp14:anchorId="5AF0F17A" wp14:editId="487C04EB">
                 <wp:simplePos x="0" y="0"/>
                 <wp:positionH relativeFrom="margin">
-                  <wp:align>right</wp:align>
+                  <wp:align>left</wp:align>
                 </wp:positionH>
                 <wp:positionV relativeFrom="paragraph">
-                  <wp:posOffset>75564</wp:posOffset>
+                  <wp:posOffset>160909</wp:posOffset>
                 </wp:positionV>
-                <wp:extent cx="5381625" cy="0"/>
-                <wp:effectExtent l="0" t="0" r="0" b="0"/>
+                <wp:extent cx="6832396" cy="7316"/>
+                <wp:effectExtent l="0" t="0" r="26035" b="31115"/>
                 <wp:wrapNone/>
-                <wp:docPr id="2" name="Straight Connector 2"/>
+                <wp:docPr id="7" name="Straight Connector 7"/>
                 <wp:cNvGraphicFramePr/>
                 <a:graphic xmlns:a="http://schemas.openxmlformats.org/drawingml/2006/main">
                   <a:graphicData uri="http://schemas.microsoft.com/office/word/2010/wordprocessingShape">
                     <wps:wsp>
                       <wps:cNvCnPr/>
                       <wps:spPr>
-                        <a:xfrm flipV="1">
+                        <a:xfrm>
                           <a:off x="0" y="0"/>
-                          <a:ext cx="5381625" cy="0"/>
+                          <a:ext cx="6832396" cy="7316"/>
                         </a:xfrm>
                         <a:prstGeom prst="line">
                           <a:avLst/>
@@ -146,13 +180,13 @@
                       </wps:spPr>
                       <wps:style>
                         <a:lnRef idx="1">
-                          <a:schemeClr val="accent1"/>
+                          <a:schemeClr val="dk1"/>
                         </a:lnRef>
                         <a:fillRef idx="0">
-                          <a:schemeClr val="accent1"/>
+                          <a:schemeClr val="dk1"/>
                         </a:fillRef>
                         <a:effectRef idx="0">
-                          <a:schemeClr val="accent1"/>
+                          <a:schemeClr val="dk1"/>
                         </a:effectRef>
                         <a:fontRef idx="minor">
                           <a:schemeClr val="tx1"/>
@@ -173,7 +207,7 @@
           </mc:Choice>
           <mc:Fallback>
             <w:pict>
-              <v:line w14:anchorId="2AF7C41D" id="Straight Connector 2" o:spid="_x0000_s1026" style="position:absolute;flip:y;z-index:251661312;visibility:visible;mso-wrap-style:square;mso-width-percent:0;mso-height-percent:0;mso-wrap-distance-left:9pt;mso-wrap-distance-top:0;mso-wrap-distance-right:9pt;mso-wrap-distance-bottom:0;mso-position-horizontal:right;mso-position-horizontal-relative:margin;mso-position-vertical:absolute;mso-position-vertical-relative:text;mso-width-percent:0;mso-height-percent:0;mso-width-relative:margin;mso-height-relative:margin" from="372.55pt,5.95pt" to="796.3pt,5.95pt" o:gfxdata="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" strokecolor="#156082 [3204]" strokeweight=".5pt">
+              <v:line w14:anchorId="4869C4CB" id="Straight Connector 7" o:spid="_x0000_s1026" style="position:absolute;z-index:251671552;visibility:visible;mso-wrap-style:square;mso-width-percent:0;mso-height-percent:0;mso-wrap-distance-left:9pt;mso-wrap-distance-top:0;mso-wrap-distance-right:9pt;mso-wrap-distance-bottom:0;mso-position-horizontal:left;mso-position-horizontal-relative:margin;mso-position-vertical:absolute;mso-position-vertical-relative:text;mso-width-percent:0;mso-height-percent:0;mso-width-relative:margin;mso-height-relative:margin" from="0,12.65pt" to="538pt,13.25pt" o:gfxdata="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" strokecolor="black [3200]" strokeweight=".5pt">
                 <v:stroke joinstyle="miter"/>
                 <w10:wrap anchorx="margin"/>
               </v:line>
@@ -186,84 +220,57 @@
           <w:rFonts w:ascii="Arial" w:hAnsi="Arial" w:cs="Arial"/>
           <w:b/>
           <w:bCs/>
-          <w:color w:val="0F9ED5" w:themeColor="accent4"/>
-          <w:sz w:val="20"/>
-          <w:szCs w:val="20"/>
-        </w:rPr>
-        <w:t>AREAS OF EXPERTISE</w:t>
-      </w:r>
-      <w:r>
+          <w:color w:val="000000" w:themeColor="text1"/>
+          <w:sz w:val="20"/>
+          <w:szCs w:val="20"/>
+        </w:rPr>
+        <w:t xml:space="preserve">AREAS OF EXPERTISE  </w:t>
+      </w:r>
+    </w:p>
+    <w:p>
+      <w:pPr>
+        <w:rPr>
+          <w:rFonts w:ascii="Arial" w:hAnsi="Arial" w:cs="Arial"/>
+          <w:color w:val="000000" w:themeColor="text1"/>
+          <w:sz w:val="20"/>
+          <w:szCs w:val="20"/>
+        </w:rPr>
+      </w:pPr>
+      <w:r>
+        <w:rPr>
+          <w:rFonts w:ascii="Arial" w:hAnsi="Arial" w:cs="Arial"/>
+          <w:color w:val="000000" w:themeColor="text1"/>
+          <w:sz w:val="20"/>
+          <w:szCs w:val="20"/>
+        </w:rPr>
+        <w:t>HTML, CSS, JavaScript, TypeScript, React, Tailwind, Bootstrap, Node.js</w:t>
+      </w:r>
+      <w:r>
+        <w:rPr>
+          <w:rFonts w:ascii="Arial" w:hAnsi="Arial" w:cs="Arial"/>
+          <w:color w:val="000000" w:themeColor="text1"/>
+          <w:sz w:val="20"/>
+          <w:szCs w:val="20"/>
+        </w:rPr>
+        <w:t>, NextJS</w:t>
+      </w:r>
+      <w:r>
+        <w:rPr>
+          <w:rFonts w:ascii="Arial" w:hAnsi="Arial" w:cs="Arial"/>
+          <w:color w:val="000000" w:themeColor="text1"/>
+          <w:sz w:val="20"/>
+          <w:szCs w:val="20"/>
+        </w:rPr>
+        <w:t>, ExpressJS MySQL, PostgreSQL, GitHub, Figma, VSCode, Canva, REST APIs</w:t>
+      </w:r>
+    </w:p>
+    <w:p>
+      <w:pPr>
         <w:rPr>
           <w:rFonts w:ascii="Arial" w:hAnsi="Arial" w:cs="Arial"/>
           <w:b/>
           <w:bCs/>
-          <w:color w:val="0F9ED5" w:themeColor="accent4"/>
-          <w:sz w:val="20"/>
-          <w:szCs w:val="20"/>
-        </w:rPr>
-        <w:t xml:space="preserve">  </w:t>
-      </w:r>
-    </w:p>
-    <w:p>
-      <w:pPr>
-        <w:rPr>
-          <w:rFonts w:ascii="Arial" w:hAnsi="Arial" w:cs="Arial"/>
-          <w:sz w:val="18"/>
-          <w:szCs w:val="18"/>
-        </w:rPr>
-      </w:pPr>
-      <w:r>
-        <w:rPr>
-          <w:rFonts w:ascii="Arial" w:hAnsi="Arial" w:cs="Arial"/>
-          <w:sz w:val="18"/>
-          <w:szCs w:val="18"/>
-        </w:rPr>
-        <w:t xml:space="preserve">HTML, CSS, JavaScript, TypeScript, React, Tailwind, Bootstrap, Node.js, </w:t>
-      </w:r>
-      <w:proofErr w:type="spellStart"/>
-      <w:r>
-        <w:rPr>
-          <w:rFonts w:ascii="Arial" w:hAnsi="Arial" w:cs="Arial"/>
-          <w:sz w:val="18"/>
-          <w:szCs w:val="18"/>
-        </w:rPr>
-        <w:t>ExpressJS</w:t>
-      </w:r>
-      <w:proofErr w:type="spellEnd"/>
-      <w:r>
-        <w:rPr>
-          <w:rFonts w:ascii="Arial" w:hAnsi="Arial" w:cs="Arial"/>
-          <w:sz w:val="18"/>
-          <w:szCs w:val="18"/>
-        </w:rPr>
-        <w:t xml:space="preserve"> MySQL, PostgreSQL, GitHub, Figma, </w:t>
-      </w:r>
-      <w:proofErr w:type="spellStart"/>
-      <w:r>
-        <w:rPr>
-          <w:rFonts w:ascii="Arial" w:hAnsi="Arial" w:cs="Arial"/>
-          <w:sz w:val="18"/>
-          <w:szCs w:val="18"/>
-        </w:rPr>
-        <w:t>VSCode</w:t>
-      </w:r>
-      <w:proofErr w:type="spellEnd"/>
-      <w:r>
-        <w:rPr>
-          <w:rFonts w:ascii="Arial" w:hAnsi="Arial" w:cs="Arial"/>
-          <w:sz w:val="18"/>
-          <w:szCs w:val="18"/>
-        </w:rPr>
-        <w:t>, Canva, REST APIs</w:t>
-      </w:r>
-    </w:p>
-    <w:p>
-      <w:pPr>
-        <w:rPr>
-          <w:rFonts w:ascii="Arial" w:hAnsi="Arial" w:cs="Arial"/>
-          <w:b/>
-          <w:bCs/>
-          <w:color w:val="0F9ED5" w:themeColor="accent4"/>
+          <w:color w:val="000000" w:themeColor="text1"/>
           <w:sz w:val="20"/>
           <w:szCs w:val="20"/>
         </w:rPr>
@@ -274,34 +281,34 @@
           <w:b/>
           <w:bCs/>
           <w:noProof/>
-          <w:color w:val="0F9ED5" w:themeColor="accent4"/>
+          <w:color w:val="000000" w:themeColor="text1"/>
           <w:sz w:val="20"/>
           <w:szCs w:val="20"/>
         </w:rPr>
         <mc:AlternateContent>
           <mc:Choice Requires="wps">
             <w:drawing>
-              <wp:anchor distT="0" distB="0" distL="114300" distR="114300" simplePos="0" relativeHeight="251659264" behindDoc="0" locked="0" layoutInCell="1" allowOverlap="1" wp14:anchorId="2BBCD0CC" wp14:editId="69A43C46">
+              <wp:anchor distT="0" distB="0" distL="114300" distR="114300" simplePos="0" relativeHeight="251669504" behindDoc="0" locked="0" layoutInCell="1" allowOverlap="1" wp14:anchorId="1B62251C" wp14:editId="0FA2B2A4">
                 <wp:simplePos x="0" y="0"/>
                 <wp:positionH relativeFrom="margin">
                   <wp:align>right</wp:align>
                 </wp:positionH>
                 <wp:positionV relativeFrom="paragraph">
-                  <wp:posOffset>65404</wp:posOffset>
+                  <wp:posOffset>160274</wp:posOffset>
                 </wp:positionV>
-                <wp:extent cx="5248275" cy="9525"/>
-                <wp:effectExtent l="0" t="0" r="28575" b="28575"/>
+                <wp:extent cx="6831965" cy="6985"/>
+                <wp:effectExtent l="0" t="0" r="26035" b="31115"/>
                 <wp:wrapNone/>
-                <wp:docPr id="1" name="Straight Connector 1"/>
+                <wp:docPr id="6" name="Straight Connector 6"/>
                 <wp:cNvGraphicFramePr/>
                 <a:graphic xmlns:a="http://schemas.openxmlformats.org/drawingml/2006/main">
                   <a:graphicData uri="http://schemas.microsoft.com/office/word/2010/wordprocessingShape">
                     <wps:wsp>
                       <wps:cNvCnPr/>
                       <wps:spPr>
-                        <a:xfrm flipV="1">
+                        <a:xfrm>
                           <a:off x="0" y="0"/>
-                          <a:ext cx="5248275" cy="9525"/>
+                          <a:ext cx="6831965" cy="6985"/>
                         </a:xfrm>
                         <a:prstGeom prst="line">
                           <a:avLst/>
@@ -309,13 +316,13 @@
                       </wps:spPr>
                       <wps:style>
                         <a:lnRef idx="1">
-                          <a:schemeClr val="accent1"/>
+                          <a:schemeClr val="dk1"/>
                         </a:lnRef>
                         <a:fillRef idx="0">
-                          <a:schemeClr val="accent1"/>
+                          <a:schemeClr val="dk1"/>
                         </a:fillRef>
                         <a:effectRef idx="0">
-                          <a:schemeClr val="accent1"/>
+                          <a:schemeClr val="dk1"/>
                         </a:effectRef>
                         <a:fontRef idx="minor">
                           <a:schemeClr val="tx1"/>
@@ -336,7 +343,7 @@
           </mc:Choice>
           <mc:Fallback>
             <w:pict>
-              <v:line w14:anchorId="6EE9028D" id="Straight Connector 1" o:spid="_x0000_s1026" style="position:absolute;flip:y;z-index:251659264;visibility:visible;mso-wrap-style:square;mso-width-percent:0;mso-height-percent:0;mso-wrap-distance-left:9pt;mso-wrap-distance-top:0;mso-wrap-distance-right:9pt;mso-wrap-distance-bottom:0;mso-position-horizontal:right;mso-position-horizontal-relative:margin;mso-position-vertical:absolute;mso-position-vertical-relative:text;mso-width-percent:0;mso-height-percent:0;mso-width-relative:margin;mso-height-relative:margin" from="362.05pt,5.15pt" to="775.3pt,5.9pt" o:gfxdata="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" strokecolor="#156082 [3204]" strokeweight=".5pt">
+              <v:line w14:anchorId="133E5051" id="Straight Connector 6" o:spid="_x0000_s1026" style="position:absolute;z-index:251669504;visibility:visible;mso-wrap-style:square;mso-width-percent:0;mso-height-percent:0;mso-wrap-distance-left:9pt;mso-wrap-distance-top:0;mso-wrap-distance-right:9pt;mso-wrap-distance-bottom:0;mso-position-horizontal:right;mso-position-horizontal-relative:margin;mso-position-vertical:absolute;mso-position-vertical-relative:text;mso-width-percent:0;mso-height-percent:0;mso-width-relative:margin;mso-height-relative:margin" from="486.75pt,12.6pt" to="1024.7pt,13.15pt" o:gfxdata="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" strokecolor="black [3200]" strokeweight=".5pt">
                 <v:stroke joinstyle="miter"/>
                 <w10:wrap anchorx="margin"/>
               </v:line>
@@ -349,79 +356,56 @@
           <w:rFonts w:ascii="Arial" w:hAnsi="Arial" w:cs="Arial"/>
           <w:b/>
           <w:bCs/>
-          <w:color w:val="0F9ED5" w:themeColor="accent4"/>
-          <w:sz w:val="20"/>
-          <w:szCs w:val="20"/>
-        </w:rPr>
-        <w:t>TECHNICAL PROJECTS</w:t>
-      </w:r>
+          <w:color w:val="000000" w:themeColor="text1"/>
+          <w:sz w:val="20"/>
+          <w:szCs w:val="20"/>
+        </w:rPr>
+        <w:t xml:space="preserve">TECHNICAL PROJECTS  </w:t>
+      </w:r>
+    </w:p>
+    <w:p>
+      <w:pPr>
+        <w:rPr>
+          <w:rFonts w:ascii="Arial" w:hAnsi="Arial" w:cs="Arial"/>
+          <w:i/>
+          <w:iCs/>
+          <w:color w:val="000000" w:themeColor="text1"/>
+          <w:sz w:val="20"/>
+          <w:szCs w:val="20"/>
+        </w:rPr>
+      </w:pPr>
       <w:r>
         <w:rPr>
           <w:rFonts w:ascii="Arial" w:hAnsi="Arial" w:cs="Arial"/>
           <w:b/>
           <w:bCs/>
-          <w:color w:val="0F9ED5" w:themeColor="accent4"/>
-          <w:sz w:val="20"/>
-          <w:szCs w:val="20"/>
-        </w:rPr>
-        <w:t xml:space="preserve">  </w:t>
-      </w:r>
-    </w:p>
-    <w:p>
-      <w:pPr>
-        <w:rPr>
-          <w:rFonts w:ascii="Arial" w:hAnsi="Arial" w:cs="Arial"/>
-          <w:sz w:val="20"/>
-          <w:szCs w:val="20"/>
-        </w:rPr>
-      </w:pPr>
-      <w:proofErr w:type="spellStart"/>
+          <w:color w:val="000000" w:themeColor="text1"/>
+          <w:sz w:val="20"/>
+          <w:szCs w:val="20"/>
+        </w:rPr>
+        <w:t xml:space="preserve">TechHub | E-Commerce Platform for PC Parts </w:t>
+      </w:r>
       <w:r>
         <w:rPr>
           <w:rFonts w:ascii="Arial" w:hAnsi="Arial" w:cs="Arial"/>
           <w:b/>
           <w:bCs/>
-          <w:sz w:val="20"/>
-          <w:szCs w:val="20"/>
-        </w:rPr>
-        <w:t>InterviewSpark</w:t>
-      </w:r>
-      <w:proofErr w:type="spellEnd"/>
-      <w:r>
-        <w:rPr>
-          <w:rFonts w:ascii="Arial" w:hAnsi="Arial" w:cs="Arial"/>
-          <w:b/>
-          <w:bCs/>
-          <w:sz w:val="20"/>
-          <w:szCs w:val="20"/>
-        </w:rPr>
-        <w:t xml:space="preserve"> | AI Interview Coach</w:t>
-      </w:r>
-      <w:r>
-        <w:rPr>
-          <w:rFonts w:ascii="Arial" w:hAnsi="Arial" w:cs="Arial"/>
-          <w:sz w:val="20"/>
-          <w:szCs w:val="20"/>
-        </w:rPr>
-        <w:t xml:space="preserve"> </w:t>
-      </w:r>
-      <w:r>
-        <w:rPr>
-          <w:rFonts w:ascii="Arial" w:hAnsi="Arial" w:cs="Arial"/>
-          <w:sz w:val="20"/>
-          <w:szCs w:val="20"/>
-        </w:rPr>
-        <w:t xml:space="preserve">                                                                                                                    </w:t>
+          <w:color w:val="000000" w:themeColor="text1"/>
+          <w:sz w:val="20"/>
+          <w:szCs w:val="20"/>
+        </w:rPr>
+        <w:t xml:space="preserve">                                                                                        </w:t>
       </w:r>
       <w:r>
         <w:rPr>
           <w:rFonts w:ascii="Arial" w:hAnsi="Arial" w:cs="Arial"/>
           <w:i/>
           <w:iCs/>
-          <w:sz w:val="20"/>
-          <w:szCs w:val="20"/>
-        </w:rPr>
-        <w:t>April 2026</w:t>
+          <w:color w:val="000000" w:themeColor="text1"/>
+          <w:sz w:val="20"/>
+          <w:szCs w:val="20"/>
+        </w:rPr>
+        <w:t>September 2026</w:t>
       </w:r>
     </w:p>
     <w:p>
@@ -431,67 +415,22 @@
           <w:numId w:val="1"/>
         </w:numPr>
         <w:spacing w:after="0"/>
-        <w:rPr>
-          <w:rFonts w:ascii="Arial" w:hAnsi="Arial" w:cs="Arial"/>
-          <w:sz w:val="18"/>
-          <w:szCs w:val="18"/>
-        </w:rPr>
-      </w:pPr>
-      <w:r>
-        <w:rPr>
-          <w:rFonts w:ascii="Arial" w:hAnsi="Arial" w:cs="Arial"/>
-          <w:sz w:val="18"/>
-          <w:szCs w:val="18"/>
-        </w:rPr>
-        <w:t xml:space="preserve">Developed an </w:t>
-      </w:r>
-      <w:r>
-        <w:rPr>
-          <w:rFonts w:ascii="Arial" w:hAnsi="Arial" w:cs="Arial"/>
-          <w:b/>
-          <w:bCs/>
-          <w:sz w:val="18"/>
-          <w:szCs w:val="18"/>
-        </w:rPr>
-        <w:t>AI-driven simulation platform</w:t>
-      </w:r>
-      <w:r>
-        <w:rPr>
-          <w:rFonts w:ascii="Arial" w:hAnsi="Arial" w:cs="Arial"/>
-          <w:sz w:val="18"/>
-          <w:szCs w:val="18"/>
-        </w:rPr>
-        <w:t xml:space="preserve"> using </w:t>
-      </w:r>
-      <w:proofErr w:type="spellStart"/>
-      <w:r>
-        <w:rPr>
-          <w:rFonts w:ascii="Arial" w:hAnsi="Arial" w:cs="Arial"/>
-          <w:b/>
-          <w:bCs/>
-          <w:sz w:val="18"/>
-          <w:szCs w:val="18"/>
-        </w:rPr>
-        <w:t>Groq</w:t>
-      </w:r>
-      <w:proofErr w:type="spellEnd"/>
-      <w:r>
-        <w:rPr>
-          <w:rFonts w:ascii="Arial" w:hAnsi="Arial" w:cs="Arial"/>
-          <w:b/>
-          <w:bCs/>
-          <w:sz w:val="18"/>
-          <w:szCs w:val="18"/>
-        </w:rPr>
-        <w:t xml:space="preserve"> API</w:t>
-      </w:r>
-      <w:r>
-        <w:rPr>
-          <w:rFonts w:ascii="Arial" w:hAnsi="Arial" w:cs="Arial"/>
-          <w:sz w:val="18"/>
-          <w:szCs w:val="18"/>
-        </w:rPr>
-        <w:t xml:space="preserve"> for technical, behavioral, and case-study interview preparation.</w:t>
+        <w:ind w:left="504"/>
+        <w:rPr>
+          <w:rFonts w:ascii="Arial" w:hAnsi="Arial" w:cs="Arial"/>
+          <w:color w:val="000000" w:themeColor="text1"/>
+          <w:sz w:val="20"/>
+          <w:szCs w:val="20"/>
+        </w:rPr>
+      </w:pPr>
+      <w:r>
+        <w:rPr>
+          <w:rFonts w:ascii="Arial" w:hAnsi="Arial" w:cs="Arial"/>
+          <w:color w:val="000000" w:themeColor="text1"/>
+          <w:sz w:val="20"/>
+          <w:szCs w:val="20"/>
+        </w:rPr>
+        <w:t>Built a full-stack e-commerce platform from scratch using Next.js, PostgreSQL, and TypeScript to manage the entire user lifecycle.</w:t>
       </w:r>
     </w:p>
     <w:p>
@@ -501,37 +440,22 @@
           <w:numId w:val="1"/>
         </w:numPr>
         <w:spacing w:after="0"/>
-        <w:rPr>
-          <w:rFonts w:ascii="Arial" w:hAnsi="Arial" w:cs="Arial"/>
-          <w:sz w:val="18"/>
-          <w:szCs w:val="18"/>
-        </w:rPr>
-      </w:pPr>
-      <w:r>
-        <w:rPr>
-          <w:rFonts w:ascii="Arial" w:hAnsi="Arial" w:cs="Arial"/>
-          <w:sz w:val="18"/>
-          <w:szCs w:val="18"/>
-        </w:rPr>
-        <w:t xml:space="preserve">Implemented an </w:t>
-      </w:r>
-      <w:r>
-        <w:rPr>
-          <w:rFonts w:ascii="Arial" w:hAnsi="Arial" w:cs="Arial"/>
-          <w:b/>
-          <w:bCs/>
-          <w:sz w:val="18"/>
-          <w:szCs w:val="18"/>
-        </w:rPr>
-        <w:t>automated feedback engine</w:t>
-      </w:r>
-      <w:r>
-        <w:rPr>
-          <w:rFonts w:ascii="Arial" w:hAnsi="Arial" w:cs="Arial"/>
-          <w:sz w:val="18"/>
-          <w:szCs w:val="18"/>
-        </w:rPr>
-        <w:t xml:space="preserve"> providing real-time scoring across 6 core metrics: technical depth, communication, clarity, confidence, relevance, and conciseness.</w:t>
+        <w:ind w:left="504"/>
+        <w:rPr>
+          <w:rFonts w:ascii="Arial" w:hAnsi="Arial" w:cs="Arial"/>
+          <w:color w:val="000000" w:themeColor="text1"/>
+          <w:sz w:val="20"/>
+          <w:szCs w:val="20"/>
+        </w:rPr>
+      </w:pPr>
+      <w:r>
+        <w:rPr>
+          <w:rFonts w:ascii="Arial" w:hAnsi="Arial" w:cs="Arial"/>
+          <w:color w:val="000000" w:themeColor="text1"/>
+          <w:sz w:val="20"/>
+          <w:szCs w:val="20"/>
+        </w:rPr>
+        <w:t>Integrated secure payments and Auth0 authentication alongside an admin dashboard for live analytics and inventory control.</w:t>
       </w:r>
     </w:p>
     <w:p>
@@ -541,98 +465,184 @@
           <w:numId w:val="1"/>
         </w:numPr>
         <w:spacing w:after="0"/>
-        <w:rPr>
-          <w:rFonts w:ascii="Arial" w:hAnsi="Arial" w:cs="Arial"/>
-          <w:sz w:val="18"/>
-          <w:szCs w:val="18"/>
-        </w:rPr>
-      </w:pPr>
-      <w:r>
-        <w:rPr>
-          <w:rFonts w:ascii="Arial" w:hAnsi="Arial" w:cs="Arial"/>
-          <w:sz w:val="18"/>
-          <w:szCs w:val="18"/>
-        </w:rPr>
-        <w:t xml:space="preserve">Engineered an </w:t>
-      </w:r>
+        <w:ind w:left="504"/>
+        <w:rPr>
+          <w:rFonts w:ascii="Arial" w:hAnsi="Arial" w:cs="Arial"/>
+          <w:color w:val="000000" w:themeColor="text1"/>
+          <w:sz w:val="20"/>
+          <w:szCs w:val="20"/>
+        </w:rPr>
+      </w:pPr>
+      <w:r>
+        <w:rPr>
+          <w:rFonts w:ascii="Arial" w:hAnsi="Arial" w:cs="Arial"/>
+          <w:color w:val="000000" w:themeColor="text1"/>
+          <w:sz w:val="20"/>
+          <w:szCs w:val="20"/>
+        </w:rPr>
+        <w:t>Designed a verified review system and a Groq-powered AI shopping assistant grounded in live product data</w:t>
+      </w:r>
+      <w:r>
+        <w:rPr>
+          <w:rFonts w:ascii="Arial" w:hAnsi="Arial" w:cs="Arial"/>
+          <w:color w:val="000000" w:themeColor="text1"/>
+          <w:sz w:val="20"/>
+          <w:szCs w:val="20"/>
+        </w:rPr>
+        <w:t>.</w:t>
+      </w:r>
+    </w:p>
+    <w:p>
+      <w:pPr>
+        <w:rPr>
+          <w:rFonts w:ascii="Arial" w:hAnsi="Arial" w:cs="Arial"/>
+          <w:color w:val="000000" w:themeColor="text1"/>
+          <w:sz w:val="20"/>
+          <w:szCs w:val="20"/>
+        </w:rPr>
+      </w:pPr>
       <w:r>
         <w:rPr>
           <w:rFonts w:ascii="Arial" w:hAnsi="Arial" w:cs="Arial"/>
           <w:b/>
           <w:bCs/>
-          <w:sz w:val="18"/>
-          <w:szCs w:val="18"/>
-        </w:rPr>
-        <w:t>analytics dashboard</w:t>
-      </w:r>
-      <w:r>
-        <w:rPr>
-          <w:rFonts w:ascii="Arial" w:hAnsi="Arial" w:cs="Arial"/>
-          <w:sz w:val="18"/>
-          <w:szCs w:val="18"/>
-        </w:rPr>
-        <w:t xml:space="preserve"> to visualize user progress, identify skill gaps, and deliver actionable performance insights.</w:t>
+          <w:color w:val="000000" w:themeColor="text1"/>
+          <w:sz w:val="20"/>
+          <w:szCs w:val="20"/>
+        </w:rPr>
+        <w:t>InterviewSpark | AI Interview Coach</w:t>
+      </w:r>
+      <w:r>
+        <w:rPr>
+          <w:rFonts w:ascii="Arial" w:hAnsi="Arial" w:cs="Arial"/>
+          <w:color w:val="000000" w:themeColor="text1"/>
+          <w:sz w:val="20"/>
+          <w:szCs w:val="20"/>
+        </w:rPr>
+        <w:t xml:space="preserve">                                                                                                                     </w:t>
+      </w:r>
+      <w:r>
+        <w:rPr>
+          <w:rFonts w:ascii="Arial" w:hAnsi="Arial" w:cs="Arial"/>
+          <w:i/>
+          <w:iCs/>
+          <w:color w:val="000000" w:themeColor="text1"/>
+          <w:sz w:val="20"/>
+          <w:szCs w:val="20"/>
+        </w:rPr>
+        <w:t>April 2026</w:t>
       </w:r>
     </w:p>
     <w:p>
       <w:pPr>
-        <w:rPr>
-          <w:rFonts w:ascii="Arial" w:hAnsi="Arial" w:cs="Arial"/>
-          <w:sz w:val="20"/>
-          <w:szCs w:val="20"/>
-        </w:rPr>
-      </w:pPr>
-      <w:proofErr w:type="spellStart"/>
+        <w:numPr>
+          <w:ilvl w:val="0"/>
+          <w:numId w:val="1"/>
+        </w:numPr>
+        <w:spacing w:after="0"/>
+        <w:ind w:left="504"/>
+        <w:rPr>
+          <w:rFonts w:ascii="Arial" w:hAnsi="Arial" w:cs="Arial"/>
+          <w:color w:val="000000" w:themeColor="text1"/>
+          <w:sz w:val="20"/>
+          <w:szCs w:val="20"/>
+        </w:rPr>
+      </w:pPr>
+      <w:r>
+        <w:rPr>
+          <w:rFonts w:ascii="Arial" w:hAnsi="Arial" w:cs="Arial"/>
+          <w:color w:val="000000" w:themeColor="text1"/>
+          <w:sz w:val="20"/>
+          <w:szCs w:val="20"/>
+        </w:rPr>
+        <w:t>Developed an AI-driven simulation platform using Groq API for technical, behavioral, and case-study interview preparation.</w:t>
+      </w:r>
+    </w:p>
+    <w:p>
+      <w:pPr>
+        <w:numPr>
+          <w:ilvl w:val="0"/>
+          <w:numId w:val="1"/>
+        </w:numPr>
+        <w:spacing w:after="0"/>
+        <w:ind w:left="504"/>
+        <w:rPr>
+          <w:rFonts w:ascii="Arial" w:hAnsi="Arial" w:cs="Arial"/>
+          <w:color w:val="000000" w:themeColor="text1"/>
+          <w:sz w:val="20"/>
+          <w:szCs w:val="20"/>
+        </w:rPr>
+      </w:pPr>
+      <w:r>
+        <w:rPr>
+          <w:rFonts w:ascii="Arial" w:hAnsi="Arial" w:cs="Arial"/>
+          <w:color w:val="000000" w:themeColor="text1"/>
+          <w:sz w:val="20"/>
+          <w:szCs w:val="20"/>
+        </w:rPr>
+        <w:t>Implemented an automated feedback engine providing real-time scoring across 6 core metrics: technical depth, communication, clarity, confidence, relevance, and conciseness.</w:t>
+      </w:r>
+    </w:p>
+    <w:p>
+      <w:pPr>
+        <w:numPr>
+          <w:ilvl w:val="0"/>
+          <w:numId w:val="1"/>
+        </w:numPr>
+        <w:spacing w:after="0"/>
+        <w:ind w:left="504"/>
+        <w:rPr>
+          <w:rFonts w:ascii="Arial" w:hAnsi="Arial" w:cs="Arial"/>
+          <w:color w:val="000000" w:themeColor="text1"/>
+          <w:sz w:val="20"/>
+          <w:szCs w:val="20"/>
+        </w:rPr>
+      </w:pPr>
+      <w:r>
+        <w:rPr>
+          <w:rFonts w:ascii="Arial" w:hAnsi="Arial" w:cs="Arial"/>
+          <w:color w:val="000000" w:themeColor="text1"/>
+          <w:sz w:val="20"/>
+          <w:szCs w:val="20"/>
+        </w:rPr>
+        <w:t>Engineered an analytics dashboard to visualize user progress, identify skill gaps, and deliver actionable performance insights.</w:t>
+      </w:r>
+    </w:p>
+    <w:p>
+      <w:pPr>
+        <w:rPr>
+          <w:rFonts w:ascii="Arial" w:hAnsi="Arial" w:cs="Arial"/>
+          <w:color w:val="000000" w:themeColor="text1"/>
+          <w:sz w:val="20"/>
+          <w:szCs w:val="20"/>
+        </w:rPr>
+      </w:pPr>
       <w:r>
         <w:rPr>
           <w:rFonts w:ascii="Arial" w:hAnsi="Arial" w:cs="Arial"/>
           <w:b/>
           <w:bCs/>
-          <w:sz w:val="20"/>
-          <w:szCs w:val="20"/>
-        </w:rPr>
-        <w:t>NavSumaro</w:t>
-      </w:r>
-      <w:proofErr w:type="spellEnd"/>
-      <w:r>
-        <w:rPr>
-          <w:rFonts w:ascii="Arial" w:hAnsi="Arial" w:cs="Arial"/>
-          <w:b/>
-          <w:bCs/>
-          <w:sz w:val="20"/>
-          <w:szCs w:val="20"/>
-        </w:rPr>
-        <w:t xml:space="preserve"> | Campus Ecosystem Platform</w:t>
-      </w:r>
-      <w:r>
-        <w:rPr>
-          <w:rFonts w:ascii="Arial" w:hAnsi="Arial" w:cs="Arial"/>
-          <w:sz w:val="20"/>
-          <w:szCs w:val="20"/>
-        </w:rPr>
-        <w:t xml:space="preserve"> </w:t>
-      </w:r>
-      <w:r>
-        <w:rPr>
-          <w:rFonts w:ascii="Arial" w:hAnsi="Arial" w:cs="Arial"/>
-          <w:sz w:val="20"/>
-          <w:szCs w:val="20"/>
-        </w:rPr>
-        <w:t xml:space="preserve">                                                                                                       </w:t>
-      </w:r>
-      <w:r>
-        <w:rPr>
-          <w:rFonts w:ascii="Arial" w:hAnsi="Arial" w:cs="Arial"/>
-          <w:sz w:val="20"/>
-          <w:szCs w:val="20"/>
-        </w:rPr>
-        <w:t xml:space="preserve"> </w:t>
+          <w:color w:val="000000" w:themeColor="text1"/>
+          <w:sz w:val="20"/>
+          <w:szCs w:val="20"/>
+        </w:rPr>
+        <w:t>NavSumaro | Campus Ecosystem Platform</w:t>
+      </w:r>
+      <w:r>
+        <w:rPr>
+          <w:rFonts w:ascii="Arial" w:hAnsi="Arial" w:cs="Arial"/>
+          <w:color w:val="000000" w:themeColor="text1"/>
+          <w:sz w:val="20"/>
+          <w:szCs w:val="20"/>
+        </w:rPr>
+        <w:t xml:space="preserve">                                                                                                         </w:t>
       </w:r>
       <w:r>
         <w:rPr>
           <w:rFonts w:ascii="Arial" w:hAnsi="Arial" w:cs="Arial"/>
           <w:i/>
           <w:iCs/>
+          <w:color w:val="000000" w:themeColor="text1"/>
           <w:sz w:val="20"/>
           <w:szCs w:val="20"/>
         </w:rPr>
@@ -646,37 +656,22 @@
           <w:numId w:val="2"/>
         </w:numPr>
         <w:spacing w:after="0"/>
-        <w:rPr>
-          <w:rFonts w:ascii="Arial" w:hAnsi="Arial" w:cs="Arial"/>
-          <w:sz w:val="18"/>
-          <w:szCs w:val="18"/>
-        </w:rPr>
-      </w:pPr>
-      <w:r>
-        <w:rPr>
-          <w:rFonts w:ascii="Arial" w:hAnsi="Arial" w:cs="Arial"/>
-          <w:sz w:val="18"/>
-          <w:szCs w:val="18"/>
-        </w:rPr>
-        <w:t xml:space="preserve">Engineered a </w:t>
-      </w:r>
-      <w:r>
-        <w:rPr>
-          <w:rFonts w:ascii="Arial" w:hAnsi="Arial" w:cs="Arial"/>
-          <w:b/>
-          <w:bCs/>
-          <w:sz w:val="18"/>
-          <w:szCs w:val="18"/>
-        </w:rPr>
-        <w:t>secure campus hub</w:t>
-      </w:r>
-      <w:r>
-        <w:rPr>
-          <w:rFonts w:ascii="Arial" w:hAnsi="Arial" w:cs="Arial"/>
-          <w:sz w:val="18"/>
-          <w:szCs w:val="18"/>
-        </w:rPr>
-        <w:t xml:space="preserve"> exclusive to institutional email domains, featuring community groups with public posting and integrated real-time chat.</w:t>
+        <w:ind w:left="504"/>
+        <w:rPr>
+          <w:rFonts w:ascii="Arial" w:hAnsi="Arial" w:cs="Arial"/>
+          <w:color w:val="000000" w:themeColor="text1"/>
+          <w:sz w:val="20"/>
+          <w:szCs w:val="20"/>
+        </w:rPr>
+      </w:pPr>
+      <w:r>
+        <w:rPr>
+          <w:rFonts w:ascii="Arial" w:hAnsi="Arial" w:cs="Arial"/>
+          <w:color w:val="000000" w:themeColor="text1"/>
+          <w:sz w:val="20"/>
+          <w:szCs w:val="20"/>
+        </w:rPr>
+        <w:t>Engineered a secure campus hub exclusive to institutional email domains, featuring community groups with public posting and integrated real-time chat.</w:t>
       </w:r>
     </w:p>
     <w:p>
@@ -686,37 +681,22 @@
           <w:numId w:val="2"/>
         </w:numPr>
         <w:spacing w:after="0"/>
-        <w:rPr>
-          <w:rFonts w:ascii="Arial" w:hAnsi="Arial" w:cs="Arial"/>
-          <w:sz w:val="18"/>
-          <w:szCs w:val="18"/>
-        </w:rPr>
-      </w:pPr>
-      <w:r>
-        <w:rPr>
-          <w:rFonts w:ascii="Arial" w:hAnsi="Arial" w:cs="Arial"/>
-          <w:sz w:val="18"/>
-          <w:szCs w:val="18"/>
-        </w:rPr>
-        <w:t xml:space="preserve">Developed a </w:t>
-      </w:r>
-      <w:r>
-        <w:rPr>
-          <w:rFonts w:ascii="Arial" w:hAnsi="Arial" w:cs="Arial"/>
-          <w:b/>
-          <w:bCs/>
-          <w:sz w:val="18"/>
-          <w:szCs w:val="18"/>
-        </w:rPr>
-        <w:t>verified P2P marketplace</w:t>
-      </w:r>
-      <w:r>
-        <w:rPr>
-          <w:rFonts w:ascii="Arial" w:hAnsi="Arial" w:cs="Arial"/>
-          <w:sz w:val="18"/>
-          <w:szCs w:val="18"/>
-        </w:rPr>
-        <w:t xml:space="preserve"> and event-hosting module to streamline student commerce and campus engagement within a trusted network.</w:t>
+        <w:ind w:left="504"/>
+        <w:rPr>
+          <w:rFonts w:ascii="Arial" w:hAnsi="Arial" w:cs="Arial"/>
+          <w:color w:val="000000" w:themeColor="text1"/>
+          <w:sz w:val="20"/>
+          <w:szCs w:val="20"/>
+        </w:rPr>
+      </w:pPr>
+      <w:r>
+        <w:rPr>
+          <w:rFonts w:ascii="Arial" w:hAnsi="Arial" w:cs="Arial"/>
+          <w:color w:val="000000" w:themeColor="text1"/>
+          <w:sz w:val="20"/>
+          <w:szCs w:val="20"/>
+        </w:rPr>
+        <w:t>Developed a verified P2P marketplace and event-hosting module to streamline student commerce and campus engagement within a trusted network.</w:t>
       </w:r>
     </w:p>
     <w:p>
@@ -726,49 +706,42 @@
           <w:numId w:val="2"/>
         </w:numPr>
         <w:spacing w:after="0"/>
-        <w:rPr>
-          <w:rFonts w:ascii="Arial" w:hAnsi="Arial" w:cs="Arial"/>
-        </w:rPr>
-      </w:pPr>
-      <w:r>
+        <w:ind w:left="504"/>
+        <w:rPr>
+          <w:rFonts w:ascii="Arial" w:hAnsi="Arial" w:cs="Arial"/>
+          <w:color w:val="000000" w:themeColor="text1"/>
+          <w:sz w:val="20"/>
+          <w:szCs w:val="20"/>
+        </w:rPr>
+      </w:pPr>
+      <w:r>
+        <w:rPr>
+          <w:rFonts w:ascii="Arial" w:hAnsi="Arial" w:cs="Arial"/>
+          <w:color w:val="000000" w:themeColor="text1"/>
+          <w:sz w:val="20"/>
+          <w:szCs w:val="20"/>
+        </w:rPr>
+        <w:t>Unified fragmented campus tools into a single platform, combining social interaction, academic support, and secure peer-to-peer transactions.</w:t>
+      </w:r>
+    </w:p>
+    <w:p>
+      <w:pPr>
+        <w:spacing w:after="0"/>
+        <w:rPr>
+          <w:rFonts w:ascii="Arial" w:hAnsi="Arial" w:cs="Arial"/>
+          <w:color w:val="000000" w:themeColor="text1"/>
+          <w:sz w:val="20"/>
+          <w:szCs w:val="20"/>
+        </w:rPr>
+      </w:pPr>
+    </w:p>
+    <w:p>
+      <w:pPr>
         <w:rPr>
           <w:rFonts w:ascii="Arial" w:hAnsi="Arial" w:cs="Arial"/>
           <w:b/>
           <w:bCs/>
-          <w:sz w:val="18"/>
-          <w:szCs w:val="18"/>
-        </w:rPr>
-        <w:t>Unified fragmented campus tools</w:t>
-      </w:r>
-      <w:r>
-        <w:rPr>
-          <w:rFonts w:ascii="Arial" w:hAnsi="Arial" w:cs="Arial"/>
-          <w:sz w:val="18"/>
-          <w:szCs w:val="18"/>
-        </w:rPr>
-        <w:t xml:space="preserve"> into a single platform, combining social interaction, academic support, and secure peer-to-peer transactions</w:t>
-      </w:r>
-      <w:r>
-        <w:rPr>
-          <w:rFonts w:ascii="Arial" w:hAnsi="Arial" w:cs="Arial"/>
-        </w:rPr>
-        <w:t>.</w:t>
-      </w:r>
-    </w:p>
-    <w:p>
-      <w:pPr>
-        <w:spacing w:after="0"/>
-        <w:rPr>
-          <w:rFonts w:ascii="Arial" w:hAnsi="Arial" w:cs="Arial"/>
-        </w:rPr>
-      </w:pPr>
-    </w:p>
-    <w:p>
-      <w:pPr>
-        <w:rPr>
-          <w:rFonts w:ascii="Arial" w:hAnsi="Arial" w:cs="Arial"/>
-          <w:b/>
-          <w:bCs/>
+          <w:color w:val="000000" w:themeColor="text1"/>
           <w:sz w:val="20"/>
           <w:szCs w:val="20"/>
         </w:rPr>
@@ -779,23 +752,23 @@
           <w:b/>
           <w:bCs/>
           <w:noProof/>
-          <w:color w:val="0F9ED5" w:themeColor="accent4"/>
+          <w:color w:val="000000" w:themeColor="text1"/>
           <w:sz w:val="20"/>
           <w:szCs w:val="20"/>
         </w:rPr>
         <mc:AlternateContent>
           <mc:Choice Requires="wps">
             <w:drawing>
-              <wp:anchor distT="0" distB="0" distL="114300" distR="114300" simplePos="0" relativeHeight="251663360" behindDoc="0" locked="0" layoutInCell="1" allowOverlap="1" wp14:anchorId="191A8DF0" wp14:editId="121F1E4D">
+              <wp:anchor distT="0" distB="0" distL="114300" distR="114300" simplePos="0" relativeHeight="251663360" behindDoc="0" locked="0" layoutInCell="1" allowOverlap="1" wp14:anchorId="191A8DF0" wp14:editId="2ADF9335">
                 <wp:simplePos x="0" y="0"/>
                 <wp:positionH relativeFrom="margin">
-                  <wp:align>right</wp:align>
+                  <wp:align>left</wp:align>
                 </wp:positionH>
                 <wp:positionV relativeFrom="paragraph">
-                  <wp:posOffset>62229</wp:posOffset>
+                  <wp:posOffset>191414</wp:posOffset>
                 </wp:positionV>
-                <wp:extent cx="6029325" cy="19050"/>
-                <wp:effectExtent l="0" t="0" r="28575" b="19050"/>
+                <wp:extent cx="6832396" cy="7316"/>
+                <wp:effectExtent l="0" t="0" r="26035" b="31115"/>
                 <wp:wrapNone/>
                 <wp:docPr id="3" name="Straight Connector 3"/>
                 <wp:cNvGraphicFramePr/>
@@ -806,7 +779,7 @@
                       <wps:spPr>
                         <a:xfrm>
                           <a:off x="0" y="0"/>
-                          <a:ext cx="6029325" cy="19050"/>
+                          <a:ext cx="6832396" cy="7316"/>
                         </a:xfrm>
                         <a:prstGeom prst="line">
                           <a:avLst/>
@@ -814,13 +787,13 @@
                       </wps:spPr>
                       <wps:style>
                         <a:lnRef idx="1">
-                          <a:schemeClr val="accent1"/>
+                          <a:schemeClr val="dk1"/>
                         </a:lnRef>
                         <a:fillRef idx="0">
-                          <a:schemeClr val="accent1"/>
+                          <a:schemeClr val="dk1"/>
                         </a:fillRef>
                         <a:effectRef idx="0">
-                          <a:schemeClr val="accent1"/>
+                          <a:schemeClr val="dk1"/>
                         </a:effectRef>
                         <a:fontRef idx="minor">
                           <a:schemeClr val="tx1"/>
@@ -841,7 +814,7 @@
           </mc:Choice>
           <mc:Fallback>
             <w:pict>
-              <v:line w14:anchorId="7F98FF1C" id="Straight Connector 3" o:spid="_x0000_s1026" style="position:absolute;z-index:251663360;visibility:visible;mso-wrap-style:square;mso-width-percent:0;mso-height-percent:0;mso-wrap-distance-left:9pt;mso-wrap-distance-top:0;mso-wrap-distance-right:9pt;mso-wrap-distance-bottom:0;mso-position-horizontal:right;mso-position-horizontal-relative:margin;mso-position-vertical:absolute;mso-position-vertical-relative:text;mso-width-percent:0;mso-height-percent:0;mso-width-relative:margin;mso-height-relative:margin" from="423.55pt,4.9pt" to="898.3pt,6.4pt" o:gfxdata="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" strokecolor="#156082 [3204]" strokeweight=".5pt">
+              <v:line w14:anchorId="7F4A0CEC" id="Straight Connector 3" o:spid="_x0000_s1026" style="position:absolute;z-index:251663360;visibility:visible;mso-wrap-style:square;mso-width-percent:0;mso-height-percent:0;mso-wrap-distance-left:9pt;mso-wrap-distance-top:0;mso-wrap-distance-right:9pt;mso-wrap-distance-bottom:0;mso-position-horizontal:left;mso-position-horizontal-relative:margin;mso-position-vertical:absolute;mso-position-vertical-relative:text;mso-width-percent:0;mso-height-percent:0;mso-width-relative:margin;mso-height-relative:margin" from="0,15.05pt" to="538pt,15.65pt" o:gfxdata="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" strokecolor="black [3200]" strokeweight=".5pt">
                 <v:stroke joinstyle="miter"/>
                 <w10:wrap anchorx="margin"/>
               </v:line>
@@ -854,7 +827,7 @@
           <w:rFonts w:ascii="Arial" w:hAnsi="Arial" w:cs="Arial"/>
           <w:b/>
           <w:bCs/>
-          <w:color w:val="0F9ED5" w:themeColor="accent4"/>
+          <w:color w:val="000000" w:themeColor="text1"/>
           <w:sz w:val="20"/>
           <w:szCs w:val="20"/>
         </w:rPr>
@@ -865,6 +838,7 @@
       <w:pPr>
         <w:rPr>
           <w:rFonts w:ascii="Arial" w:hAnsi="Arial" w:cs="Arial"/>
+          <w:color w:val="000000" w:themeColor="text1"/>
           <w:sz w:val="20"/>
           <w:szCs w:val="20"/>
         </w:rPr>
@@ -874,6 +848,7 @@
           <w:rFonts w:ascii="Arial" w:hAnsi="Arial" w:cs="Arial"/>
           <w:b/>
           <w:bCs/>
+          <w:color w:val="000000" w:themeColor="text1"/>
           <w:sz w:val="20"/>
           <w:szCs w:val="20"/>
         </w:rPr>
@@ -882,6 +857,7 @@
       <w:r>
         <w:rPr>
           <w:rFonts w:ascii="Arial" w:hAnsi="Arial" w:cs="Arial"/>
+          <w:color w:val="000000" w:themeColor="text1"/>
           <w:sz w:val="20"/>
           <w:szCs w:val="20"/>
         </w:rPr>
@@ -892,24 +868,38 @@
           <w:rFonts w:ascii="Arial" w:hAnsi="Arial" w:cs="Arial"/>
           <w:i/>
           <w:iCs/>
-          <w:sz w:val="20"/>
-          <w:szCs w:val="20"/>
-        </w:rPr>
-        <w:t>2023 – 2026</w:t>
-      </w:r>
-      <w:r>
-        <w:rPr>
-          <w:rFonts w:ascii="Arial" w:hAnsi="Arial" w:cs="Arial"/>
-          <w:sz w:val="20"/>
-          <w:szCs w:val="20"/>
-        </w:rPr>
-        <w:t xml:space="preserve"> </w:t>
+          <w:color w:val="000000" w:themeColor="text1"/>
+          <w:sz w:val="20"/>
+          <w:szCs w:val="20"/>
+        </w:rPr>
+        <w:t>2023 – 202</w:t>
       </w:r>
       <w:r>
         <w:rPr>
           <w:rFonts w:ascii="Arial" w:hAnsi="Arial" w:cs="Arial"/>
           <w:i/>
           <w:iCs/>
+          <w:color w:val="000000" w:themeColor="text1"/>
+          <w:sz w:val="20"/>
+          <w:szCs w:val="20"/>
+        </w:rPr>
+        <w:t>7</w:t>
+      </w:r>
+      <w:r>
+        <w:rPr>
+          <w:rFonts w:ascii="Arial" w:hAnsi="Arial" w:cs="Arial"/>
+          <w:color w:val="000000" w:themeColor="text1"/>
+          <w:sz w:val="20"/>
+          <w:szCs w:val="20"/>
+        </w:rPr>
+        <w:t xml:space="preserve"> </w:t>
+      </w:r>
+      <w:r>
+        <w:rPr>
+          <w:rFonts w:ascii="Arial" w:hAnsi="Arial" w:cs="Arial"/>
+          <w:i/>
+          <w:iCs/>
+          <w:color w:val="000000" w:themeColor="text1"/>
           <w:sz w:val="20"/>
           <w:szCs w:val="20"/>
         </w:rPr>
@@ -923,17 +913,20 @@
           <w:numId w:val="3"/>
         </w:numPr>
         <w:spacing w:after="0"/>
-        <w:rPr>
-          <w:rFonts w:ascii="Arial" w:hAnsi="Arial" w:cs="Arial"/>
-          <w:sz w:val="18"/>
-          <w:szCs w:val="18"/>
-        </w:rPr>
-      </w:pPr>
-      <w:r>
-        <w:rPr>
-          <w:rFonts w:ascii="Arial" w:hAnsi="Arial" w:cs="Arial"/>
-          <w:sz w:val="18"/>
-          <w:szCs w:val="18"/>
+        <w:ind w:left="504"/>
+        <w:rPr>
+          <w:rFonts w:ascii="Arial" w:hAnsi="Arial" w:cs="Arial"/>
+          <w:color w:val="000000" w:themeColor="text1"/>
+          <w:sz w:val="20"/>
+          <w:szCs w:val="20"/>
+        </w:rPr>
+      </w:pPr>
+      <w:r>
+        <w:rPr>
+          <w:rFonts w:ascii="Arial" w:hAnsi="Arial" w:cs="Arial"/>
+          <w:color w:val="000000" w:themeColor="text1"/>
+          <w:sz w:val="20"/>
+          <w:szCs w:val="20"/>
         </w:rPr>
         <w:t>2023-2024 Dean’s Lister (1st and 2nd Semester)</w:t>
       </w:r>
@@ -945,19 +938,58 @@
           <w:numId w:val="3"/>
         </w:numPr>
         <w:spacing w:after="0"/>
-        <w:rPr>
-          <w:rFonts w:ascii="Arial" w:hAnsi="Arial" w:cs="Arial"/>
-          <w:sz w:val="18"/>
-          <w:szCs w:val="18"/>
-        </w:rPr>
-      </w:pPr>
-      <w:r>
-        <w:rPr>
-          <w:rFonts w:ascii="Arial" w:hAnsi="Arial" w:cs="Arial"/>
-          <w:sz w:val="18"/>
-          <w:szCs w:val="18"/>
-        </w:rPr>
-        <w:t>3rd Year Bachelor of Science in Information Systems</w:t>
+        <w:ind w:left="504"/>
+        <w:rPr>
+          <w:rFonts w:ascii="Arial" w:hAnsi="Arial" w:cs="Arial"/>
+          <w:color w:val="000000" w:themeColor="text1"/>
+          <w:sz w:val="20"/>
+          <w:szCs w:val="20"/>
+        </w:rPr>
+      </w:pPr>
+      <w:r>
+        <w:rPr>
+          <w:rFonts w:ascii="Arial" w:hAnsi="Arial" w:cs="Arial"/>
+          <w:color w:val="000000" w:themeColor="text1"/>
+          <w:sz w:val="20"/>
+          <w:szCs w:val="20"/>
+        </w:rPr>
+        <w:t>202</w:t>
+      </w:r>
+      <w:r>
+        <w:rPr>
+          <w:rFonts w:ascii="Arial" w:hAnsi="Arial" w:cs="Arial"/>
+          <w:color w:val="000000" w:themeColor="text1"/>
+          <w:sz w:val="20"/>
+          <w:szCs w:val="20"/>
+        </w:rPr>
+        <w:t>5</w:t>
+      </w:r>
+      <w:r>
+        <w:rPr>
+          <w:rFonts w:ascii="Arial" w:hAnsi="Arial" w:cs="Arial"/>
+          <w:color w:val="000000" w:themeColor="text1"/>
+          <w:sz w:val="20"/>
+          <w:szCs w:val="20"/>
+        </w:rPr>
+        <w:t>-202</w:t>
+      </w:r>
+      <w:r>
+        <w:rPr>
+          <w:rFonts w:ascii="Arial" w:hAnsi="Arial" w:cs="Arial"/>
+          <w:color w:val="000000" w:themeColor="text1"/>
+          <w:sz w:val="20"/>
+          <w:szCs w:val="20"/>
+        </w:rPr>
+        <w:t>6</w:t>
+      </w:r>
+      <w:r>
+        <w:rPr>
+          <w:rFonts w:ascii="Arial" w:hAnsi="Arial" w:cs="Arial"/>
+          <w:color w:val="000000" w:themeColor="text1"/>
+          <w:sz w:val="20"/>
+          <w:szCs w:val="20"/>
+        </w:rPr>
+        <w:t xml:space="preserve"> Dean’s Lister (2nd Semester)</w:t>
       </w:r>
     </w:p>
     <w:p>
@@ -965,8 +997,9 @@
         <w:spacing w:after="0"/>
         <w:rPr>
           <w:rFonts w:ascii="Arial" w:hAnsi="Arial" w:cs="Arial"/>
-          <w:sz w:val="18"/>
-          <w:szCs w:val="18"/>
+          <w:color w:val="000000" w:themeColor="text1"/>
+          <w:sz w:val="20"/>
+          <w:szCs w:val="20"/>
         </w:rPr>
       </w:pPr>
     </w:p>
@@ -976,7 +1009,7 @@
           <w:rFonts w:ascii="Arial" w:hAnsi="Arial" w:cs="Arial"/>
           <w:b/>
           <w:bCs/>
-          <w:color w:val="0F9ED5" w:themeColor="accent4"/>
+          <w:color w:val="000000" w:themeColor="text1"/>
           <w:sz w:val="20"/>
           <w:szCs w:val="20"/>
         </w:rPr>
@@ -987,34 +1020,34 @@
           <w:b/>
           <w:bCs/>
           <w:noProof/>
-          <w:color w:val="0F9ED5" w:themeColor="accent4"/>
+          <w:color w:val="000000" w:themeColor="text1"/>
           <w:sz w:val="20"/>
           <w:szCs w:val="20"/>
         </w:rPr>
         <mc:AlternateContent>
           <mc:Choice Requires="wps">
             <w:drawing>
-              <wp:anchor distT="0" distB="0" distL="114300" distR="114300" simplePos="0" relativeHeight="251665408" behindDoc="0" locked="0" layoutInCell="1" allowOverlap="1" wp14:anchorId="118820FA" wp14:editId="349EAD41">
+              <wp:anchor distT="0" distB="0" distL="114300" distR="114300" simplePos="0" relativeHeight="251667456" behindDoc="0" locked="0" layoutInCell="1" allowOverlap="1" wp14:anchorId="59914B9F" wp14:editId="305DDDA4">
                 <wp:simplePos x="0" y="0"/>
                 <wp:positionH relativeFrom="margin">
-                  <wp:align>right</wp:align>
+                  <wp:align>left</wp:align>
                 </wp:positionH>
                 <wp:positionV relativeFrom="paragraph">
-                  <wp:posOffset>71119</wp:posOffset>
+                  <wp:posOffset>170459</wp:posOffset>
                 </wp:positionV>
-                <wp:extent cx="5715000" cy="28575"/>
-                <wp:effectExtent l="0" t="0" r="19050" b="28575"/>
+                <wp:extent cx="6832396" cy="7316"/>
+                <wp:effectExtent l="0" t="0" r="26035" b="31115"/>
                 <wp:wrapNone/>
-                <wp:docPr id="4" name="Straight Connector 4"/>
+                <wp:docPr id="5" name="Straight Connector 5"/>
                 <wp:cNvGraphicFramePr/>
                 <a:graphic xmlns:a="http://schemas.openxmlformats.org/drawingml/2006/main">
                   <a:graphicData uri="http://schemas.microsoft.com/office/word/2010/wordprocessingShape">
                     <wps:wsp>
                       <wps:cNvCnPr/>
                       <wps:spPr>
-                        <a:xfrm flipV="1">
+                        <a:xfrm>
                           <a:off x="0" y="0"/>
-                          <a:ext cx="5715000" cy="28575"/>
+                          <a:ext cx="6832396" cy="7316"/>
                         </a:xfrm>
                         <a:prstGeom prst="line">
                           <a:avLst/>
@@ -1022,13 +1055,13 @@
                       </wps:spPr>
                       <wps:style>
                         <a:lnRef idx="1">
-                          <a:schemeClr val="accent1"/>
+                          <a:schemeClr val="dk1"/>
                         </a:lnRef>
                         <a:fillRef idx="0">
-                          <a:schemeClr val="accent1"/>
+                          <a:schemeClr val="dk1"/>
                         </a:fillRef>
                         <a:effectRef idx="0">
-                          <a:schemeClr val="accent1"/>
+                          <a:schemeClr val="dk1"/>
                         </a:effectRef>
                         <a:fontRef idx="minor">
                           <a:schemeClr val="tx1"/>
@@ -1049,7 +1082,7 @@
           </mc:Choice>
           <mc:Fallback>
             <w:pict>
-              <v:line w14:anchorId="119E74F8" id="Straight Connector 4" o:spid="_x0000_s1026" style="position:absolute;flip:y;z-index:251665408;visibility:visible;mso-wrap-style:square;mso-width-percent:0;mso-height-percent:0;mso-wrap-distance-left:9pt;mso-wrap-distance-top:0;mso-wrap-distance-right:9pt;mso-wrap-distance-bottom:0;mso-position-horizontal:right;mso-position-horizontal-relative:margin;mso-position-vertical:absolute;mso-position-vertical-relative:text;mso-width-percent:0;mso-height-percent:0;mso-width-relative:margin;mso-height-relative:margin" from="398.8pt,5.6pt" to="848.8pt,7.85pt" o:gfxdata="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" strokecolor="#156082 [3204]" strokeweight=".5pt">
+              <v:line w14:anchorId="6A3E0A80" id="Straight Connector 5" o:spid="_x0000_s1026" style="position:absolute;z-index:251667456;visibility:visible;mso-wrap-style:square;mso-width-percent:0;mso-height-percent:0;mso-wrap-distance-left:9pt;mso-wrap-distance-top:0;mso-wrap-distance-right:9pt;mso-wrap-distance-bottom:0;mso-position-horizontal:left;mso-position-horizontal-relative:margin;mso-position-vertical:absolute;mso-position-vertical-relative:text;mso-width-percent:0;mso-height-percent:0;mso-width-relative:margin;mso-height-relative:margin" from="0,13.4pt" to="538pt,14pt" o:gfxdata="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" strokecolor="black [3200]" strokeweight=".5pt">
                 <v:stroke joinstyle="miter"/>
                 <w10:wrap anchorx="margin"/>
               </v:line>
@@ -1062,7 +1095,7 @@
           <w:rFonts w:ascii="Arial" w:hAnsi="Arial" w:cs="Arial"/>
           <w:b/>
           <w:bCs/>
-          <w:color w:val="0F9ED5" w:themeColor="accent4"/>
+          <w:color w:val="000000" w:themeColor="text1"/>
           <w:sz w:val="20"/>
           <w:szCs w:val="20"/>
         </w:rPr>
@@ -1076,10 +1109,12 @@
           <w:numId w:val="4"/>
         </w:numPr>
         <w:spacing w:after="0"/>
-        <w:rPr>
-          <w:rFonts w:ascii="Arial" w:hAnsi="Arial" w:cs="Arial"/>
-          <w:sz w:val="18"/>
-          <w:szCs w:val="18"/>
+        <w:ind w:left="504"/>
+        <w:rPr>
+          <w:rFonts w:ascii="Arial" w:hAnsi="Arial" w:cs="Arial"/>
+          <w:color w:val="000000" w:themeColor="text1"/>
+          <w:sz w:val="20"/>
+          <w:szCs w:val="20"/>
         </w:rPr>
       </w:pPr>
       <w:r>
@@ -1087,68 +1122,47 @@
           <w:rFonts w:ascii="Arial" w:hAnsi="Arial" w:cs="Arial"/>
           <w:b/>
           <w:bCs/>
-          <w:sz w:val="18"/>
-          <w:szCs w:val="18"/>
+          <w:color w:val="000000" w:themeColor="text1"/>
+          <w:sz w:val="20"/>
+          <w:szCs w:val="20"/>
         </w:rPr>
         <w:t>JavaScript Developer Certification</w:t>
       </w:r>
       <w:r>
         <w:rPr>
           <w:rFonts w:ascii="Arial" w:hAnsi="Arial" w:cs="Arial"/>
-          <w:sz w:val="18"/>
-          <w:szCs w:val="18"/>
+          <w:color w:val="000000" w:themeColor="text1"/>
+          <w:sz w:val="20"/>
+          <w:szCs w:val="20"/>
         </w:rPr>
         <w:t xml:space="preserve"> </w:t>
       </w:r>
       <w:r>
         <w:rPr>
           <w:rFonts w:ascii="Arial" w:hAnsi="Arial" w:cs="Arial"/>
-          <w:sz w:val="18"/>
-          <w:szCs w:val="18"/>
-        </w:rPr>
-        <w:t xml:space="preserve">                                                                                                         </w:t>
-      </w:r>
-      <w:r>
-        <w:rPr>
-          <w:rFonts w:ascii="Arial" w:hAnsi="Arial" w:cs="Arial"/>
-          <w:sz w:val="18"/>
-          <w:szCs w:val="18"/>
-        </w:rPr>
-        <w:t xml:space="preserve"> </w:t>
-      </w:r>
-      <w:proofErr w:type="spellStart"/>
-      <w:r>
-        <w:rPr>
-          <w:rFonts w:ascii="Arial" w:hAnsi="Arial" w:cs="Arial"/>
-          <w:sz w:val="18"/>
-          <w:szCs w:val="18"/>
-        </w:rPr>
-        <w:t>freeCodeCamp</w:t>
-      </w:r>
-      <w:proofErr w:type="spellEnd"/>
-      <w:r>
-        <w:rPr>
-          <w:rFonts w:ascii="Arial" w:hAnsi="Arial" w:cs="Arial"/>
-          <w:sz w:val="18"/>
-          <w:szCs w:val="18"/>
-        </w:rPr>
-        <w:t xml:space="preserve"> </w:t>
-      </w:r>
-      <w:r>
-        <w:rPr>
-          <w:rFonts w:ascii="Arial" w:hAnsi="Arial" w:cs="Arial"/>
-          <w:sz w:val="18"/>
-          <w:szCs w:val="18"/>
-        </w:rPr>
-        <w:t xml:space="preserve">| </w:t>
-      </w:r>
-      <w:r>
-        <w:rPr>
-          <w:rFonts w:ascii="Arial" w:hAnsi="Arial" w:cs="Arial"/>
-          <w:sz w:val="18"/>
-          <w:szCs w:val="18"/>
-        </w:rPr>
-        <w:t>2026</w:t>
+          <w:color w:val="000000" w:themeColor="text1"/>
+          <w:sz w:val="20"/>
+          <w:szCs w:val="20"/>
+        </w:rPr>
+        <w:t>(</w:t>
+      </w:r>
+      <w:r>
+        <w:rPr>
+          <w:rFonts w:ascii="Arial" w:hAnsi="Arial" w:cs="Arial"/>
+          <w:color w:val="000000" w:themeColor="text1"/>
+          <w:sz w:val="20"/>
+          <w:szCs w:val="20"/>
+        </w:rPr>
+        <w:t>freeCodeCamp | 2026</w:t>
+      </w:r>
+      <w:r>
+        <w:rPr>
+          <w:rFonts w:ascii="Arial" w:hAnsi="Arial" w:cs="Arial"/>
+          <w:color w:val="000000" w:themeColor="text1"/>
+          <w:sz w:val="20"/>
+          <w:szCs w:val="20"/>
+        </w:rPr>
+        <w:t>)</w:t>
       </w:r>
     </w:p>
     <w:p>
@@ -1158,10 +1172,12 @@
           <w:numId w:val="4"/>
         </w:numPr>
         <w:spacing w:after="0"/>
-        <w:rPr>
-          <w:rFonts w:ascii="Arial" w:hAnsi="Arial" w:cs="Arial"/>
-          <w:sz w:val="18"/>
-          <w:szCs w:val="18"/>
+        <w:ind w:left="504"/>
+        <w:rPr>
+          <w:rFonts w:ascii="Arial" w:hAnsi="Arial" w:cs="Arial"/>
+          <w:color w:val="000000" w:themeColor="text1"/>
+          <w:sz w:val="20"/>
+          <w:szCs w:val="20"/>
         </w:rPr>
       </w:pPr>
       <w:r>
@@ -1169,66 +1185,54 @@
           <w:rFonts w:ascii="Arial" w:hAnsi="Arial" w:cs="Arial"/>
           <w:b/>
           <w:bCs/>
-          <w:sz w:val="18"/>
-          <w:szCs w:val="18"/>
+          <w:color w:val="000000" w:themeColor="text1"/>
+          <w:sz w:val="20"/>
+          <w:szCs w:val="20"/>
         </w:rPr>
         <w:t>Responsive Web Design Certification</w:t>
       </w:r>
       <w:r>
         <w:rPr>
           <w:rFonts w:ascii="Arial" w:hAnsi="Arial" w:cs="Arial"/>
-          <w:sz w:val="18"/>
-          <w:szCs w:val="18"/>
+          <w:color w:val="000000" w:themeColor="text1"/>
+          <w:sz w:val="20"/>
+          <w:szCs w:val="20"/>
         </w:rPr>
         <w:t xml:space="preserve"> </w:t>
       </w:r>
       <w:r>
         <w:rPr>
           <w:rFonts w:ascii="Arial" w:hAnsi="Arial" w:cs="Arial"/>
-          <w:sz w:val="18"/>
-          <w:szCs w:val="18"/>
-        </w:rPr>
-        <w:t xml:space="preserve">                                                                                                     </w:t>
-      </w:r>
-      <w:proofErr w:type="spellStart"/>
-      <w:r>
-        <w:rPr>
-          <w:rFonts w:ascii="Arial" w:hAnsi="Arial" w:cs="Arial"/>
-          <w:sz w:val="18"/>
-          <w:szCs w:val="18"/>
-        </w:rPr>
-        <w:t>freeCodeCamp</w:t>
-      </w:r>
-      <w:proofErr w:type="spellEnd"/>
-      <w:r>
-        <w:rPr>
-          <w:rFonts w:ascii="Arial" w:hAnsi="Arial" w:cs="Arial"/>
-          <w:sz w:val="18"/>
-          <w:szCs w:val="18"/>
-        </w:rPr>
-        <w:t xml:space="preserve"> </w:t>
-      </w:r>
-      <w:r>
-        <w:rPr>
-          <w:rFonts w:ascii="Arial" w:hAnsi="Arial" w:cs="Arial"/>
-          <w:sz w:val="18"/>
-          <w:szCs w:val="18"/>
-        </w:rPr>
-        <w:t xml:space="preserve">| </w:t>
-      </w:r>
-      <w:r>
-        <w:rPr>
-          <w:rFonts w:ascii="Arial" w:hAnsi="Arial" w:cs="Arial"/>
-          <w:sz w:val="18"/>
-          <w:szCs w:val="18"/>
-        </w:rPr>
-        <w:t>2026</w:t>
+          <w:color w:val="000000" w:themeColor="text1"/>
+          <w:sz w:val="20"/>
+          <w:szCs w:val="20"/>
+        </w:rPr>
+        <w:t>(</w:t>
+      </w:r>
+      <w:r>
+        <w:rPr>
+          <w:rFonts w:ascii="Arial" w:hAnsi="Arial" w:cs="Arial"/>
+          <w:color w:val="000000" w:themeColor="text1"/>
+          <w:sz w:val="20"/>
+          <w:szCs w:val="20"/>
+        </w:rPr>
+        <w:t>freeCodeCamp | 202</w:t>
+      </w:r>
+      <w:r>
+        <w:rPr>
+          <w:rFonts w:ascii="Arial" w:hAnsi="Arial" w:cs="Arial"/>
+          <w:color w:val="000000" w:themeColor="text1"/>
+          <w:sz w:val="20"/>
+          <w:szCs w:val="20"/>
+        </w:rPr>
+        <w:t>6)</w:t>
       </w:r>
     </w:p>
     <w:p>
       <w:pPr>
         <w:rPr>
           <w:rFonts w:ascii="Arial" w:hAnsi="Arial" w:cs="Arial"/>
+          <w:color w:val="000000" w:themeColor="text1"/>
         </w:rPr>
       </w:pPr>
     </w:p>
@@ -1702,6 +1706,155 @@
       <w:lvlJc w:val="left"/>
       <w:pPr>
         <w:tabs>
+          <w:tab w:val="num" w:pos="2520"/>
+        </w:tabs>
+        <w:ind w:left="2520" w:hanging="360"/>
+      </w:pPr>
+      <w:rPr>
+        <w:rFonts w:ascii="Symbol" w:hAnsi="Symbol" w:hint="default"/>
+        <w:sz w:val="20"/>
+      </w:rPr>
+    </w:lvl>
+    <w:lvl w:ilvl="1" w:tentative="1">
+      <w:start w:val="1"/>
+      <w:numFmt w:val="bullet"/>
+      <w:lvlText w:val="o"/>
+      <w:lvlJc w:val="left"/>
+      <w:pPr>
+        <w:tabs>
+          <w:tab w:val="num" w:pos="3240"/>
+        </w:tabs>
+        <w:ind w:left="3240" w:hanging="360"/>
+      </w:pPr>
+      <w:rPr>
+        <w:rFonts w:ascii="Courier New" w:hAnsi="Courier New" w:hint="default"/>
+        <w:sz w:val="20"/>
+      </w:rPr>
+    </w:lvl>
+    <w:lvl w:ilvl="2" w:tentative="1">
+      <w:start w:val="1"/>
+      <w:numFmt w:val="bullet"/>
+      <w:lvlText w:val=""/>
+      <w:lvlJc w:val="left"/>
+      <w:pPr>
+        <w:tabs>
+          <w:tab w:val="num" w:pos="3960"/>
+        </w:tabs>
+        <w:ind w:left="3960" w:hanging="360"/>
+      </w:pPr>
+      <w:rPr>
+        <w:rFonts w:ascii="Wingdings" w:hAnsi="Wingdings" w:hint="default"/>
+        <w:sz w:val="20"/>
+      </w:rPr>
+    </w:lvl>
+    <w:lvl w:ilvl="3" w:tentative="1">
+      <w:start w:val="1"/>
+      <w:numFmt w:val="bullet"/>
+      <w:lvlText w:val=""/>
+      <w:lvlJc w:val="left"/>
+      <w:pPr>
+        <w:tabs>
+          <w:tab w:val="num" w:pos="4680"/>
+        </w:tabs>
+        <w:ind w:left="4680" w:hanging="360"/>
+      </w:pPr>
+      <w:rPr>
+        <w:rFonts w:ascii="Wingdings" w:hAnsi="Wingdings" w:hint="default"/>
+        <w:sz w:val="20"/>
+      </w:rPr>
+    </w:lvl>
+    <w:lvl w:ilvl="4" w:tentative="1">
+      <w:start w:val="1"/>
+      <w:numFmt w:val="bullet"/>
+      <w:lvlText w:val=""/>
+      <w:lvlJc w:val="left"/>
+      <w:pPr>
+        <w:tabs>
+          <w:tab w:val="num" w:pos="5400"/>
+        </w:tabs>
+        <w:ind w:left="5400" w:hanging="360"/>
+      </w:pPr>
+      <w:rPr>
+        <w:rFonts w:ascii="Wingdings" w:hAnsi="Wingdings" w:hint="default"/>
+        <w:sz w:val="20"/>
+      </w:rPr>
+    </w:lvl>
+    <w:lvl w:ilvl="5" w:tentative="1">
+      <w:start w:val="1"/>
+      <w:numFmt w:val="bullet"/>
+      <w:lvlText w:val=""/>
+      <w:lvlJc w:val="left"/>
+      <w:pPr>
+        <w:tabs>
+          <w:tab w:val="num" w:pos="6120"/>
+        </w:tabs>
+        <w:ind w:left="6120" w:hanging="360"/>
+      </w:pPr>
+      <w:rPr>
+        <w:rFonts w:ascii="Wingdings" w:hAnsi="Wingdings" w:hint="default"/>
+        <w:sz w:val="20"/>
+      </w:rPr>
+    </w:lvl>
+    <w:lvl w:ilvl="6" w:tentative="1">
+      <w:start w:val="1"/>
+      <w:numFmt w:val="bullet"/>
+      <w:lvlText w:val=""/>
+      <w:lvlJc w:val="left"/>
+      <w:pPr>
+        <w:tabs>
+          <w:tab w:val="num" w:pos="6840"/>
+        </w:tabs>
+        <w:ind w:left="6840" w:hanging="360"/>
+      </w:pPr>
+      <w:rPr>
+        <w:rFonts w:ascii="Wingdings" w:hAnsi="Wingdings" w:hint="default"/>
+        <w:sz w:val="20"/>
+      </w:rPr>
+    </w:lvl>
+    <w:lvl w:ilvl="7" w:tentative="1">
+      <w:start w:val="1"/>
+      <w:numFmt w:val="bullet"/>
+      <w:lvlText w:val=""/>
+      <w:lvlJc w:val="left"/>
+      <w:pPr>
+        <w:tabs>
+          <w:tab w:val="num" w:pos="7560"/>
+        </w:tabs>
+        <w:ind w:left="7560" w:hanging="360"/>
+      </w:pPr>
+      <w:rPr>
+        <w:rFonts w:ascii="Wingdings" w:hAnsi="Wingdings" w:hint="default"/>
+        <w:sz w:val="20"/>
+      </w:rPr>
+    </w:lvl>
+    <w:lvl w:ilvl="8" w:tentative="1">
+      <w:start w:val="1"/>
+      <w:numFmt w:val="bullet"/>
+      <w:lvlText w:val=""/>
+      <w:lvlJc w:val="left"/>
+      <w:pPr>
+        <w:tabs>
+          <w:tab w:val="num" w:pos="8280"/>
+        </w:tabs>
+        <w:ind w:left="8280" w:hanging="360"/>
+      </w:pPr>
+      <w:rPr>
+        <w:rFonts w:ascii="Wingdings" w:hAnsi="Wingdings" w:hint="default"/>
+        <w:sz w:val="20"/>
+      </w:rPr>
+    </w:lvl>
+  </w:abstractNum>
+  <w:abstractNum w:abstractNumId="4" w15:restartNumberingAfterBreak="0">
+    <w:nsid w:val="75186751"/>
+    <w:multiLevelType w:val="multilevel"/>
+    <w:tmpl w:val="C3FE9F16"/>
+    <w:lvl w:ilvl="0">
+      <w:start w:val="1"/>
+      <w:numFmt w:val="bullet"/>
+      <w:lvlText w:val=""/>
+      <w:lvlJc w:val="left"/>
+      <w:pPr>
+        <w:tabs>
           <w:tab w:val="num" w:pos="720"/>
         </w:tabs>
         <w:ind w:left="720" w:hanging="360"/>
@@ -1851,6 +2004,9 @@
   </w:num>
   <w:num w:numId="4" w16cid:durableId="325862059">
     <w:abstractNumId w:val="2"/>
+  </w:num>
+  <w:num w:numId="5" w16cid:durableId="1074276667">
+    <w:abstractNumId w:val="4"/>
   </w:num>
 </w:numbering>
 </file>

</xml_diff>